<commit_message>
Clarify user guide workflows
Explain GPS versus address lookup and clarify visit notes, printing, unsaved edits, and updates.

Co-authored-by: Copilot <223556219+Copilot@users.noreply.github.com>
</commit_message>
<xml_diff>
--- a/Return Visits App User Guide.docx
+++ b/Return Visits App User Guide.docx
@@ -136,12 +136,51 @@
         <w:pStyle w:val="ListBullet"/>
       </w:pPr>
       <w:r>
-        <w:t>Use the Map button in the bottom navigation to view contacts that have map coordinates. To add or adjust a pin, edit a contact and use the map in its form, device GPS (if permitted), or Find Address on Map.</w:t>
+        <w:t>If you choose Exit or close the editor after making changes, the app asks whether to leave without saving. Confirming discards those changes; canceling keeps the editor open.</w:t>
       </w:r>
     </w:p>
     <w:p>
+      <w:pPr>
+        <w:pStyle w:val="ListBullet"/>
+      </w:pPr>
       <w:r>
-        <w:t>Map tiles and address lookup need an internet connection. If you choose Find Address on Map, the address text is sent to OpenStreetMap Nominatim to find a location. The app explains this beside the address-search button.</w:t>
+        <w:t>Use the Map button in the bottom navigation to view contacts that have map coordinates. Contacts without coordinates do not have a pin on the map.</w:t>
+      </w:r>
+    </w:p>
+    <w:p>
+      <w:pPr/>
+      <w:r>
+        <w:t>To add or adjust a pin, edit the contact and use one of these options:</w:t>
+      </w:r>
+    </w:p>
+    <w:p>
+      <w:pPr>
+        <w:pStyle w:val="ListBullet"/>
+      </w:pPr>
+      <w:r>
+        <w:t>Get GPS uses your device's current location. It does not use the contact's typed address. Your browser may ask permission to access location, and the device's location services must be on.</w:t>
+      </w:r>
+    </w:p>
+    <w:p>
+      <w:pPr>
+        <w:pStyle w:val="ListBullet"/>
+      </w:pPr>
+      <w:r>
+        <w:t>Find Address on Map searches for the street address, city, and state entered for the contact. This requires internet access, and the address text is sent to OpenStreetMap Nominatim for lookup.</w:t>
+      </w:r>
+    </w:p>
+    <w:p>
+      <w:pPr>
+        <w:pStyle w:val="ListBullet"/>
+      </w:pPr>
+      <w:r>
+        <w:t>You can also tap the map to place the pin or drag the existing pin to adjust it. Check that the pin is in the right place before choosing Save; address searches may not identify the exact entrance or building.</w:t>
+      </w:r>
+    </w:p>
+    <w:p>
+      <w:pPr/>
+      <w:r>
+        <w:t>Map tiles also need an internet connection. Coordinates are optional, so you can save a contact without a pin and add coordinates later.</w:t>
       </w:r>
     </w:p>
     <w:p>
@@ -173,7 +212,7 @@
         <w:pStyle w:val="ListBullet"/>
       </w:pPr>
       <w:r>
-        <w:t>Add a visit note from the contact card or while editing a contact. Existing notes can be edited or deleted from the contact editor.</w:t>
+        <w:t>On the contact card, type a note into the 'Add visit log...' box and choose the plus button to save it with today's date and time. In the contact editor, enter a note and choose Save; you can adjust its date and time there. Existing notes can be edited or deleted from the contact editor.</w:t>
       </w:r>
     </w:p>
     <w:p>
@@ -205,7 +244,7 @@
         <w:pStyle w:val="ListBullet"/>
       </w:pPr>
       <w:r>
-        <w:t>A list print includes each contact once, grouped under their most specific location, and includes only their latest note.</w:t>
+        <w:t>A list print includes each contact once, grouped under its most specific location: Area, or Region if there is no Area, or City if there is no Region or Area. Contacts without any of these are grouped under No location assigned. Each contact's list entry includes only its latest note.</w:t>
       </w:r>
     </w:p>
     <w:p>
@@ -279,7 +318,7 @@
     </w:p>
     <w:p>
       <w:r>
-        <w:t>On another device, open the app at https://grasfulls.github.io/return-visits-app/ in a web browser. Your contacts will not appear automatically; restore an encrypted backup using the instructions in "Protect your information and make a backup" above. On a phone, you can optionally add the app to your Home Screen: in Safari on iPhone, use Share then Add to Home Screen; in Chrome on Android, choose Install app or Add to Home screen.</w:t>
+        <w:t>On another device, open the app at https://grasfulls.github.io/return-visits-app/ in a web browser. Your contacts will not appear automatically; restore an encrypted backup using the instructions in "Protect your information and make a backup" above. On a phone, you can optionally add the app to your Home Screen: in Safari on iPhone, use Share then Add to Home Screen; in Chrome on Android, choose Install app or Add to Home screen. The app checks for updates when opened online. If it was already open when an update was published, refresh the page or close and reopen the app while connected to the internet.</w:t>
       </w:r>
     </w:p>
     <w:sectPr>

</xml_diff>

<commit_message>
Explain moving from browser to Home Screen app
Co-authored-by: Copilot <223556219+Copilot@users.noreply.github.com>
</commit_message>
<xml_diff>
--- a/Return Visits App User Guide.docx
+++ b/Return Visits App User Guide.docx
@@ -319,6 +319,20 @@
     <w:p>
       <w:r>
         <w:t>On another device, open the app at https://grasfulls.github.io/return-visits-app/ in a web browser. Your contacts will not appear automatically; restore an encrypted backup using the instructions in "Protect your information and make a backup" above. On a phone, you can optionally add the app to your Home Screen: in Safari on iPhone, use Share then Add to Home Screen; in Chrome on Android, choose Install app or Add to Home screen. The app checks for updates when opened online. If it was already open when an update was published, refresh the page or close and reopen the app while connected to the internet.</w:t>
+      </w:r>
+    </w:p>
+    <w:p>
+      <w:pPr>
+        <w:pStyle w:val="Heading2"/>
+      </w:pPr>
+      <w:r>
+        <w:t>Already using the app in your phone's browser?</w:t>
+      </w:r>
+    </w:p>
+    <w:p>
+      <w:pPr/>
+      <w:r>
+        <w:t>Adding the app to your Home Screen may open the same local contacts, but do not assume the browser and Home Screen app share data. Open the Home Screen app and try the passphrase you already use. If it asks you to create a new passphrase or appears to start with an empty contact list, stop before setting it up. Return to the browser version where your contacts are visible and export an encrypted backup from Settings ? Export Data Backup. Then open the Home Screen app and choose Choose Backup to Restore on its unlock screen, or use its restore option in Settings. Keep the browser version and its data until you have confirmed your contacts are visible in the Home Screen app.</w:t>
       </w:r>
     </w:p>
     <w:sectPr>

</xml_diff>

<commit_message>
Recommend Home Screen app for phone use
Co-authored-by: Copilot <223556219+Copilot@users.noreply.github.com>
</commit_message>
<xml_diff>
--- a/Return Visits App User Guide.docx
+++ b/Return Visits App User Guide.docx
@@ -23,13 +23,13 @@
         <w:pStyle w:val="Heading2"/>
       </w:pPr>
       <w:r>
-        <w:t>Before you start: choose one place to use the app</w:t>
+        <w:t>Before you start: recommended phone setup</w:t>
       </w:r>
     </w:p>
     <w:p>
       <w:pPr/>
       <w:r>
-        <w:t>Choose either a browser on one device or the app added to that device's Home Screen for your regular use. They may keep separate contact data and do not automatically sync; adding a Home Screen icon does not transfer contacts already saved in your browser. If you have already entered contacts, keep using that version or first export an encrypted backup and restore it in the version you want to use. The app is free to use but has no online sync service. Using multiple copies means manually transferring backups and keeping track of which copy has your latest changes. See 'Protect your information and make a backup' later in this guide before switching.</w:t>
+        <w:t>For regular phone use, we recommend adding Return Visits to your Home Screen and using that copy consistently. It opens like an app, but its contacts are still stored locally on this device. The browser version and Home Screen app may keep separate data and do not automatically sync; adding the icon does not transfer contacts already saved in your browser. If you already entered contacts in a browser, either continue using that browser or export an encrypted backup and restore it in the Home Screen app before switching. The app is free to use but has no online sync service, so maintaining multiple copies requires manual backup and restore. See 'Protect your information and make a backup' later in this guide.</w:t>
       </w:r>
     </w:p>
     <w:p>

</xml_diff>

<commit_message>
Document how to remove local app data
Co-authored-by: Copilot <223556219+Copilot@users.noreply.github.com>
</commit_message>
<xml_diff>
--- a/Return Visits App User Guide.docx
+++ b/Return Visits App User Guide.docx
@@ -341,6 +341,60 @@
         <w:pStyle w:val="Heading1"/>
       </w:pPr>
       <w:r>
+        <w:t>Stop using the app and remove its saved data</w:t>
+      </w:r>
+    </w:p>
+    <w:p>
+      <w:pPr/>
+      <w:r>
+        <w:t>Uninstalling or removing the Home Screen app may not remove a separate browser copy, and browser and Home Screen copies may store data separately. To remove the app's local contacts and settings, clear the site data or delete the Home Screen app copy as described below. This permanently deletes that copy. If you want to keep your contacts, export an encrypted backup first.</w:t>
+      </w:r>
+    </w:p>
+    <w:p>
+      <w:pPr>
+        <w:pStyle w:val="ListBullet"/>
+      </w:pPr>
+      <w:r>
+        <w:t>iPhone or iPad ? To remove the Safari browser copy, open iOS Settings ? Safari ? Advanced ? Website Data, find grasfulls.github.io, and delete its website data. To remove a separate Home Screen app copy, touch and hold its icon, choose Remove App, then Delete App. Menu names may vary slightly by iOS version.</w:t>
+      </w:r>
+    </w:p>
+    <w:p>
+      <w:pPr>
+        <w:pStyle w:val="ListBullet"/>
+      </w:pPr>
+      <w:r>
+        <w:t>Android (Chrome) ? Open Chrome site settings for grasfulls.github.io and choose Clear data or Clear &amp; reset. You can also find the site under Settings ? Site settings ? All sites. Menu names may vary by Chrome version.</w:t>
+      </w:r>
+    </w:p>
+    <w:p>
+      <w:pPr>
+        <w:pStyle w:val="ListBullet"/>
+      </w:pPr>
+      <w:r>
+        <w:t>Other browsers or computers ? Use the browser website-data or site-storage settings to remove data for grasfulls.github.io.</w:t>
+      </w:r>
+    </w:p>
+    <w:p>
+      <w:pPr>
+        <w:pStyle w:val="ListBullet"/>
+      </w:pPr>
+      <w:r>
+        <w:t>Repeat these steps for each browser and device where you used the app; each may contain a separate copy. Uninstall the Home Screen app separately if you also want to remove its icon.</w:t>
+      </w:r>
+    </w:p>
+    <w:p>
+      <w:pPr>
+        <w:pStyle w:val="ListBullet"/>
+      </w:pPr>
+      <w:r>
+        <w:t>Downloaded backups, exported contact files, PDFs, and printed copies are separate. Delete them separately from Downloads, Files, cloud storage, or wherever you saved or shared them.</w:t>
+      </w:r>
+    </w:p>
+    <w:p>
+      <w:pPr>
+        <w:pStyle w:val="Heading1"/>
+      </w:pPr>
+      <w:r>
         <w:t>Use the app on another device</w:t>
       </w:r>
     </w:p>

</xml_diff>

<commit_message>
Document safe consolidation of app copies
Co-authored-by: Copilot <223556219+Copilot@users.noreply.github.com>
</commit_message>
<xml_diff>
--- a/Return Visits App User Guide.docx
+++ b/Return Visits App User Guide.docx
@@ -63,6 +63,12 @@
       <w:pPr/>
       <w:r>
         <w:t>Before changing devices or browsers, clearing browser data, or removing and reinstalling the app, make an encrypted backup. Local records may become unavailable after these changes. To use your contacts again, restore the backup on the device where you reinstall or open the app. Step-by-step instructions are in "Protect your information and make a backup" near the end of this guide.</w:t>
+      </w:r>
+    </w:p>
+    <w:p>
+      <w:pPr/>
+      <w:r>
+        <w:t>Have contacts in more than one browser or app copy? Choose one copy to keep before deleting anything. Full backups replace the destination and cannot be merged. To combine several copies, use one as the base and import individual contacts from the others. Verify the combined records, make a fresh backup, and only then remove unused copies. See "Consolidate copies and remove unused data" later in this guide.</w:t>
       </w:r>
     </w:p>
     <w:p>
@@ -334,6 +340,74 @@
       </w:pPr>
       <w:r>
         <w:t>To share one contact, use that contact card's export/download action. This creates an encrypted contact file. Give the recipient the file and its separate sharing passphrase through different channels. Import it from Settings; it adds that contact without replacing the recipient's other contacts.</w:t>
+      </w:r>
+    </w:p>
+    <w:p>
+      <w:pPr>
+        <w:pStyle w:val="Heading1"/>
+      </w:pPr>
+      <w:r>
+        <w:t>Consolidate copies and remove unused data</w:t>
+      </w:r>
+    </w:p>
+    <w:p>
+      <w:pPr/>
+      <w:r>
+        <w:t>If Safari, Chrome, and a Home Screen app each contain contacts, they are separate copies and do not sync. For regular phone use, choose the Home Screen app as the one copy to keep. A full backup restore replaces the destination collection; it does not merge two backups.</w:t>
+      </w:r>
+    </w:p>
+    <w:p>
+      <w:pPr>
+        <w:pStyle w:val="ListNumber"/>
+      </w:pPr>
+      <w:r>
+        <w:t>Choose the copy that will be your permanent collection. If the destination already contains contacts you want to keep, leave it in place and import other contacts into it individually. Do not restore another full backup over it unless you are willing to replace its current contacts and settings.</w:t>
+      </w:r>
+    </w:p>
+    <w:p>
+      <w:pPr>
+        <w:pStyle w:val="ListNumber"/>
+      </w:pPr>
+      <w:r>
+        <w:t>Before changing anything, export an encrypted full backup from every copy that contains information you may need. Keep these backups until you have finished and verified consolidation.</w:t>
+      </w:r>
+    </w:p>
+    <w:p>
+      <w:pPr>
+        <w:pStyle w:val="ListNumber"/>
+      </w:pPr>
+      <w:r>
+        <w:t>Use the full backup from your chosen base copy to populate the destination, if needed. From every other copy, export contacts one at a time using each contact card export button, then import each encrypted contact file into the destination from Settings, Share a Contact. Individual imports add contacts without replacing the collection; this can take time for large collections.</w:t>
+      </w:r>
+    </w:p>
+    <w:p>
+      <w:pPr>
+        <w:pStyle w:val="ListNumber"/>
+      </w:pPr>
+      <w:r>
+        <w:t>Review the destination for missing or duplicate contacts and confirm important visit notes are present. Importing may create duplicates if the same person is already there.</w:t>
+      </w:r>
+    </w:p>
+    <w:p>
+      <w:pPr>
+        <w:pStyle w:val="ListNumber"/>
+      </w:pPr>
+      <w:r>
+        <w:t>Export a new encrypted full backup from the destination. Keep it safe and confirm you know its passphrase before deleting any source copy.</w:t>
+      </w:r>
+    </w:p>
+    <w:p>
+      <w:pPr>
+        <w:pStyle w:val="ListNumber"/>
+      </w:pPr>
+      <w:r>
+        <w:t>Only after verification, remove unused copies using the instructions below. Clear data only for a source copy you no longer need. If the browser controls do not make it clear which copy will be removed, do not clear it until you have confirmed the surviving copy still opens with all contacts.</w:t>
+      </w:r>
+    </w:p>
+    <w:p>
+      <w:pPr/>
+      <w:r>
+        <w:t>Full backups cannot be merged directly. If you need contacts from another full backup, import its contacts individually; restoring that full backup will replace the destination. Do not delete source data or backup files until the destination has been checked and backed up.</w:t>
       </w:r>
     </w:p>
     <w:p>

</xml_diff>